<commit_message>
Add co-authors and update supplementary file
</commit_message>
<xml_diff>
--- a/SUPPLEMENTARY_EN.docx
+++ b/SUPPLEMENTARY_EN.docx
@@ -37,7 +37,16 @@
         <w:jc w:val="both"/>
       </w:pPr>
       <w:r>
-        <w:t xml:space="preserve">Alican Çatık · ORCID: 0000-0002-0226-7804</w:t>
+        <w:t xml:space="preserve">Alican Çatık, Mithat Ekşi, Serdar Karadağ, Alper Bitkin</w:t>
+      </w:r>
+    </w:p>
+    <w:p>
+      <w:pPr>
+        <w:spacing w:after="140" w:line="300"/>
+        <w:jc w:val="both"/>
+      </w:pPr>
+      <w:r>
+        <w:t xml:space="preserve">Corresponding author: Alican Çatık · ORCID: 0000-0002-0226-7804</w:t>
       </w:r>
     </w:p>
     <w:p>
@@ -1746,7 +1755,7 @@
                 <w:sz w:val="17"/>
                 <w:szCs w:val="17"/>
               </w:rPr>
-              <w:t xml:space="preserve">—</w:t>
+              <w:t xml:space="preserve">§2.5</w:t>
             </w:r>
           </w:p>
         </w:tc>
@@ -1771,16 +1780,16 @@
                 <w:sz w:val="17"/>
                 <w:szCs w:val="17"/>
               </w:rPr>
-              <w:t xml:space="preserve">Not applicable</w:t>
-            </w:r>
-            <w:r>
-              <w:rPr>
-                <w:b w:val="false"/>
-                <w:bCs w:val="false"/>
-                <w:sz w:val="17"/>
-                <w:szCs w:val="17"/>
-              </w:rPr>
-              <w:t xml:space="preserve"> — single-author study; stated in §5</w:t>
+              <w:t xml:space="preserve">Met</w:t>
+            </w:r>
+            <w:r>
+              <w:rPr>
+                <w:b w:val="false"/>
+                <w:bCs w:val="false"/>
+                <w:sz w:val="17"/>
+                <w:szCs w:val="17"/>
+              </w:rPr>
+              <w:t xml:space="preserve"> — the 64 borderline records were decided by discussion among three authors</w:t>
             </w:r>
           </w:p>
         </w:tc>
@@ -2943,7 +2952,7 @@
         <w:jc w:val="both"/>
       </w:pPr>
       <w:r>
-        <w:t xml:space="preserve">Nineteen of the 20 items are met. The single unmet item, item 11, is marked as optional in the guideline itself.</w:t>
+        <w:t xml:space="preserve">Nineteen of the 20 items are fully met and one is partially met. Item 11, which is marked as optional in the assessment by three authors; in this study the records were assessed independently by two.</w:t>
       </w:r>
     </w:p>
     <w:p>

</xml_diff>

<commit_message>
Document the screening procedure in the supplementary file
</commit_message>
<xml_diff>
--- a/SUPPLEMENTARY_EN.docx
+++ b/SUPPLEMENTARY_EN.docx
@@ -260,6 +260,1109 @@
       </w:r>
       <w:r>
         <w:t xml:space="preserve"> records concerning other cancers or diseases, or in which the bladder was incidental; mechanism and tumour-biology studies; treatment, surgery, drug development and radiotherapy studies; tissue- and histopathology-based studies (immunohistochemistry, whole slide imaging, tissue genomics); invasive and endoscopic methods; studies confined to upper urinary tract urothelial carcinoma; clinical guidelines and general disease reviews; studies with mixed cohorts or covering several cancer types together.</w:t>
+      </w:r>
+    </w:p>
+    <w:p>
+      <w:pPr>
+        <w:pStyle w:val="Heading2"/>
+        <w:spacing w:after="130" w:before="260"/>
+        <w:jc w:val="left"/>
+      </w:pPr>
+      <w:r>
+        <w:rPr>
+          <w:b/>
+          <w:bCs/>
+          <w:sz w:val="23"/>
+          <w:szCs w:val="23"/>
+        </w:rPr>
+        <w:t xml:space="preserve">Screening procedure</w:t>
+      </w:r>
+    </w:p>
+    <w:p>
+      <w:pPr>
+        <w:spacing w:after="140" w:line="300"/>
+        <w:jc w:val="both"/>
+      </w:pPr>
+      <w:r>
+        <w:t xml:space="preserve">The criteria above were applied through the following ordered procedure. Each record was assessed against the steps in sequence and assigned at the first step that matched.</w:t>
+      </w:r>
+    </w:p>
+    <w:tbl>
+      <w:tblPr>
+        <w:tblW w:type="dxa" w:w="9070"/>
+        <w:tblBorders>
+          <w:top w:val="single" w:color="auto" w:sz="4"/>
+          <w:left w:val="single" w:color="auto" w:sz="4"/>
+          <w:bottom w:val="single" w:color="auto" w:sz="4"/>
+          <w:right w:val="single" w:color="auto" w:sz="4"/>
+          <w:insideH w:val="single" w:color="auto" w:sz="4"/>
+          <w:insideV w:val="single" w:color="auto" w:sz="4"/>
+        </w:tblBorders>
+      </w:tblPr>
+      <w:tblGrid>
+        <w:gridCol w:w="3023"/>
+        <w:gridCol w:w="3023"/>
+        <w:gridCol w:w="3024"/>
+      </w:tblGrid>
+      <w:tr>
+        <w:trPr>
+          <w:tblHeader/>
+        </w:trPr>
+        <w:tc>
+          <w:tcPr>
+            <w:tcW w:type="dxa" w:w="3023"/>
+            <w:shd w:fill="EFEFEF" w:val="clear"/>
+            <w:tcMar>
+              <w:top w:type="dxa" w:w="60"/>
+              <w:left w:type="dxa" w:w="90"/>
+              <w:bottom w:type="dxa" w:w="60"/>
+              <w:right w:type="dxa" w:w="90"/>
+            </w:tcMar>
+          </w:tcPr>
+          <w:p>
+            <w:pPr>
+              <w:spacing w:after="0" w:line="260"/>
+            </w:pPr>
+            <w:r>
+              <w:rPr>
+                <w:b/>
+                <w:bCs/>
+                <w:sz w:val="17"/>
+                <w:szCs w:val="17"/>
+              </w:rPr>
+              <w:t xml:space="preserve">Step</w:t>
+            </w:r>
+          </w:p>
+        </w:tc>
+        <w:tc>
+          <w:tcPr>
+            <w:tcW w:type="dxa" w:w="3023"/>
+            <w:shd w:fill="EFEFEF" w:val="clear"/>
+            <w:tcMar>
+              <w:top w:type="dxa" w:w="60"/>
+              <w:left w:type="dxa" w:w="90"/>
+              <w:bottom w:type="dxa" w:w="60"/>
+              <w:right w:type="dxa" w:w="90"/>
+            </w:tcMar>
+          </w:tcPr>
+          <w:p>
+            <w:pPr>
+              <w:spacing w:after="0" w:line="260"/>
+            </w:pPr>
+            <w:r>
+              <w:rPr>
+                <w:b/>
+                <w:bCs/>
+                <w:sz w:val="17"/>
+                <w:szCs w:val="17"/>
+              </w:rPr>
+              <w:t xml:space="preserve">Condition (evaluated on the title unless stated)</w:t>
+            </w:r>
+          </w:p>
+        </w:tc>
+        <w:tc>
+          <w:tcPr>
+            <w:tcW w:type="dxa" w:w="3024"/>
+            <w:shd w:fill="EFEFEF" w:val="clear"/>
+            <w:tcMar>
+              <w:top w:type="dxa" w:w="60"/>
+              <w:left w:type="dxa" w:w="90"/>
+              <w:bottom w:type="dxa" w:w="60"/>
+              <w:right w:type="dxa" w:w="90"/>
+            </w:tcMar>
+          </w:tcPr>
+          <w:p>
+            <w:pPr>
+              <w:spacing w:after="0" w:line="260"/>
+            </w:pPr>
+            <w:r>
+              <w:rPr>
+                <w:b/>
+                <w:bCs/>
+                <w:sz w:val="17"/>
+                <w:szCs w:val="17"/>
+              </w:rPr>
+              <w:t xml:space="preserve">Outcome</w:t>
+            </w:r>
+          </w:p>
+        </w:tc>
+      </w:tr>
+      <w:tr>
+        <w:tc>
+          <w:tcPr>
+            <w:tcW w:type="dxa" w:w="3023"/>
+            <w:tcMar>
+              <w:top w:type="dxa" w:w="60"/>
+              <w:left w:type="dxa" w:w="90"/>
+              <w:bottom w:type="dxa" w:w="60"/>
+              <w:right w:type="dxa" w:w="90"/>
+            </w:tcMar>
+          </w:tcPr>
+          <w:p>
+            <w:pPr>
+              <w:spacing w:after="0" w:line="260"/>
+            </w:pPr>
+            <w:r>
+              <w:rPr>
+                <w:b w:val="false"/>
+                <w:bCs w:val="false"/>
+                <w:sz w:val="17"/>
+                <w:szCs w:val="17"/>
+              </w:rPr>
+              <w:t xml:space="preserve">1</w:t>
+            </w:r>
+          </w:p>
+        </w:tc>
+        <w:tc>
+          <w:tcPr>
+            <w:tcW w:type="dxa" w:w="3023"/>
+            <w:tcMar>
+              <w:top w:type="dxa" w:w="60"/>
+              <w:left w:type="dxa" w:w="90"/>
+              <w:bottom w:type="dxa" w:w="60"/>
+              <w:right w:type="dxa" w:w="90"/>
+            </w:tcMar>
+          </w:tcPr>
+          <w:p>
+            <w:pPr>
+              <w:spacing w:after="0" w:line="260"/>
+            </w:pPr>
+            <w:r>
+              <w:rPr>
+                <w:b w:val="false"/>
+                <w:bCs w:val="false"/>
+                <w:sz w:val="17"/>
+                <w:szCs w:val="17"/>
+              </w:rPr>
+              <w:t xml:space="preserve">Minimal residual disease terms present (ctDNA/MRD exception)</w:t>
+            </w:r>
+          </w:p>
+        </w:tc>
+        <w:tc>
+          <w:tcPr>
+            <w:tcW w:type="dxa" w:w="3024"/>
+            <w:tcMar>
+              <w:top w:type="dxa" w:w="60"/>
+              <w:left w:type="dxa" w:w="90"/>
+              <w:bottom w:type="dxa" w:w="60"/>
+              <w:right w:type="dxa" w:w="90"/>
+            </w:tcMar>
+          </w:tcPr>
+          <w:p>
+            <w:pPr>
+              <w:spacing w:after="0" w:line="260"/>
+            </w:pPr>
+            <w:r>
+              <w:rPr>
+                <w:b/>
+                <w:bCs/>
+                <w:sz w:val="17"/>
+                <w:szCs w:val="17"/>
+              </w:rPr>
+              <w:t xml:space="preserve">Include</w:t>
+            </w:r>
+          </w:p>
+        </w:tc>
+      </w:tr>
+      <w:tr>
+        <w:tc>
+          <w:tcPr>
+            <w:tcW w:type="dxa" w:w="3023"/>
+            <w:tcMar>
+              <w:top w:type="dxa" w:w="60"/>
+              <w:left w:type="dxa" w:w="90"/>
+              <w:bottom w:type="dxa" w:w="60"/>
+              <w:right w:type="dxa" w:w="90"/>
+            </w:tcMar>
+          </w:tcPr>
+          <w:p>
+            <w:pPr>
+              <w:spacing w:after="0" w:line="260"/>
+            </w:pPr>
+            <w:r>
+              <w:rPr>
+                <w:b w:val="false"/>
+                <w:bCs w:val="false"/>
+                <w:sz w:val="17"/>
+                <w:szCs w:val="17"/>
+              </w:rPr>
+              <w:t xml:space="preserve">2</w:t>
+            </w:r>
+          </w:p>
+        </w:tc>
+        <w:tc>
+          <w:tcPr>
+            <w:tcW w:type="dxa" w:w="3023"/>
+            <w:tcMar>
+              <w:top w:type="dxa" w:w="60"/>
+              <w:left w:type="dxa" w:w="90"/>
+              <w:bottom w:type="dxa" w:w="60"/>
+              <w:right w:type="dxa" w:w="90"/>
+            </w:tcMar>
+          </w:tcPr>
+          <w:p>
+            <w:pPr>
+              <w:spacing w:after="0" w:line="260"/>
+            </w:pPr>
+            <w:r>
+              <w:rPr>
+                <w:b w:val="false"/>
+                <w:bCs w:val="false"/>
+                <w:sz w:val="17"/>
+                <w:szCs w:val="17"/>
+              </w:rPr>
+              <w:t xml:space="preserve">No bladder or urothelial term</w:t>
+            </w:r>
+          </w:p>
+        </w:tc>
+        <w:tc>
+          <w:tcPr>
+            <w:tcW w:type="dxa" w:w="3024"/>
+            <w:tcMar>
+              <w:top w:type="dxa" w:w="60"/>
+              <w:left w:type="dxa" w:w="90"/>
+              <w:bottom w:type="dxa" w:w="60"/>
+              <w:right w:type="dxa" w:w="90"/>
+            </w:tcMar>
+          </w:tcPr>
+          <w:p>
+            <w:pPr>
+              <w:spacing w:after="0" w:line="260"/>
+            </w:pPr>
+            <w:r>
+              <w:rPr>
+                <w:b w:val="false"/>
+                <w:bCs w:val="false"/>
+                <w:sz w:val="17"/>
+                <w:szCs w:val="17"/>
+              </w:rPr>
+              <w:t xml:space="preserve">Exclude</w:t>
+            </w:r>
+          </w:p>
+        </w:tc>
+      </w:tr>
+      <w:tr>
+        <w:tc>
+          <w:tcPr>
+            <w:tcW w:type="dxa" w:w="3023"/>
+            <w:tcMar>
+              <w:top w:type="dxa" w:w="60"/>
+              <w:left w:type="dxa" w:w="90"/>
+              <w:bottom w:type="dxa" w:w="60"/>
+              <w:right w:type="dxa" w:w="90"/>
+            </w:tcMar>
+          </w:tcPr>
+          <w:p>
+            <w:pPr>
+              <w:spacing w:after="0" w:line="260"/>
+            </w:pPr>
+            <w:r>
+              <w:rPr>
+                <w:b w:val="false"/>
+                <w:bCs w:val="false"/>
+                <w:sz w:val="17"/>
+                <w:szCs w:val="17"/>
+              </w:rPr>
+              <w:t xml:space="preserve">3</w:t>
+            </w:r>
+          </w:p>
+        </w:tc>
+        <w:tc>
+          <w:tcPr>
+            <w:tcW w:type="dxa" w:w="3023"/>
+            <w:tcMar>
+              <w:top w:type="dxa" w:w="60"/>
+              <w:left w:type="dxa" w:w="90"/>
+              <w:bottom w:type="dxa" w:w="60"/>
+              <w:right w:type="dxa" w:w="90"/>
+            </w:tcMar>
+          </w:tcPr>
+          <w:p>
+            <w:pPr>
+              <w:spacing w:after="0" w:line="260"/>
+            </w:pPr>
+            <w:r>
+              <w:rPr>
+                <w:b w:val="false"/>
+                <w:bCs w:val="false"/>
+                <w:sz w:val="17"/>
+                <w:szCs w:val="17"/>
+              </w:rPr>
+              <w:t xml:space="preserve">Upper urinary tract terms only, no bladder term</w:t>
+            </w:r>
+          </w:p>
+        </w:tc>
+        <w:tc>
+          <w:tcPr>
+            <w:tcW w:type="dxa" w:w="3024"/>
+            <w:tcMar>
+              <w:top w:type="dxa" w:w="60"/>
+              <w:left w:type="dxa" w:w="90"/>
+              <w:bottom w:type="dxa" w:w="60"/>
+              <w:right w:type="dxa" w:w="90"/>
+            </w:tcMar>
+          </w:tcPr>
+          <w:p>
+            <w:pPr>
+              <w:spacing w:after="0" w:line="260"/>
+            </w:pPr>
+            <w:r>
+              <w:rPr>
+                <w:b w:val="false"/>
+                <w:bCs w:val="false"/>
+                <w:sz w:val="17"/>
+                <w:szCs w:val="17"/>
+              </w:rPr>
+              <w:t xml:space="preserve">Exclude</w:t>
+            </w:r>
+          </w:p>
+        </w:tc>
+      </w:tr>
+      <w:tr>
+        <w:tc>
+          <w:tcPr>
+            <w:tcW w:type="dxa" w:w="3023"/>
+            <w:tcMar>
+              <w:top w:type="dxa" w:w="60"/>
+              <w:left w:type="dxa" w:w="90"/>
+              <w:bottom w:type="dxa" w:w="60"/>
+              <w:right w:type="dxa" w:w="90"/>
+            </w:tcMar>
+          </w:tcPr>
+          <w:p>
+            <w:pPr>
+              <w:spacing w:after="0" w:line="260"/>
+            </w:pPr>
+            <w:r>
+              <w:rPr>
+                <w:b w:val="false"/>
+                <w:bCs w:val="false"/>
+                <w:sz w:val="17"/>
+                <w:szCs w:val="17"/>
+              </w:rPr>
+              <w:t xml:space="preserve">4</w:t>
+            </w:r>
+          </w:p>
+        </w:tc>
+        <w:tc>
+          <w:tcPr>
+            <w:tcW w:type="dxa" w:w="3023"/>
+            <w:tcMar>
+              <w:top w:type="dxa" w:w="60"/>
+              <w:left w:type="dxa" w:w="90"/>
+              <w:bottom w:type="dxa" w:w="60"/>
+              <w:right w:type="dxa" w:w="90"/>
+            </w:tcMar>
+          </w:tcPr>
+          <w:p>
+            <w:pPr>
+              <w:spacing w:after="0" w:line="260"/>
+            </w:pPr>
+            <w:r>
+              <w:rPr>
+                <w:b w:val="false"/>
+                <w:bCs w:val="false"/>
+                <w:sz w:val="17"/>
+                <w:szCs w:val="17"/>
+              </w:rPr>
+              <w:t xml:space="preserve">Tissue or histopathology terms</w:t>
+            </w:r>
+          </w:p>
+        </w:tc>
+        <w:tc>
+          <w:tcPr>
+            <w:tcW w:type="dxa" w:w="3024"/>
+            <w:tcMar>
+              <w:top w:type="dxa" w:w="60"/>
+              <w:left w:type="dxa" w:w="90"/>
+              <w:bottom w:type="dxa" w:w="60"/>
+              <w:right w:type="dxa" w:w="90"/>
+            </w:tcMar>
+          </w:tcPr>
+          <w:p>
+            <w:pPr>
+              <w:spacing w:after="0" w:line="260"/>
+            </w:pPr>
+            <w:r>
+              <w:rPr>
+                <w:b w:val="false"/>
+                <w:bCs w:val="false"/>
+                <w:sz w:val="17"/>
+                <w:szCs w:val="17"/>
+              </w:rPr>
+              <w:t xml:space="preserve">Exclude</w:t>
+            </w:r>
+          </w:p>
+        </w:tc>
+      </w:tr>
+      <w:tr>
+        <w:tc>
+          <w:tcPr>
+            <w:tcW w:type="dxa" w:w="3023"/>
+            <w:tcMar>
+              <w:top w:type="dxa" w:w="60"/>
+              <w:left w:type="dxa" w:w="90"/>
+              <w:bottom w:type="dxa" w:w="60"/>
+              <w:right w:type="dxa" w:w="90"/>
+            </w:tcMar>
+          </w:tcPr>
+          <w:p>
+            <w:pPr>
+              <w:spacing w:after="0" w:line="260"/>
+            </w:pPr>
+            <w:r>
+              <w:rPr>
+                <w:b w:val="false"/>
+                <w:bCs w:val="false"/>
+                <w:sz w:val="17"/>
+                <w:szCs w:val="17"/>
+              </w:rPr>
+              <w:t xml:space="preserve">5</w:t>
+            </w:r>
+          </w:p>
+        </w:tc>
+        <w:tc>
+          <w:tcPr>
+            <w:tcW w:type="dxa" w:w="3023"/>
+            <w:tcMar>
+              <w:top w:type="dxa" w:w="60"/>
+              <w:left w:type="dxa" w:w="90"/>
+              <w:bottom w:type="dxa" w:w="60"/>
+              <w:right w:type="dxa" w:w="90"/>
+            </w:tcMar>
+          </w:tcPr>
+          <w:p>
+            <w:pPr>
+              <w:spacing w:after="0" w:line="260"/>
+            </w:pPr>
+            <w:r>
+              <w:rPr>
+                <w:b w:val="false"/>
+                <w:bCs w:val="false"/>
+                <w:sz w:val="17"/>
+                <w:szCs w:val="17"/>
+              </w:rPr>
+              <w:t xml:space="preserve">Invasive or endoscopic method terms</w:t>
+            </w:r>
+          </w:p>
+        </w:tc>
+        <w:tc>
+          <w:tcPr>
+            <w:tcW w:type="dxa" w:w="3024"/>
+            <w:tcMar>
+              <w:top w:type="dxa" w:w="60"/>
+              <w:left w:type="dxa" w:w="90"/>
+              <w:bottom w:type="dxa" w:w="60"/>
+              <w:right w:type="dxa" w:w="90"/>
+            </w:tcMar>
+          </w:tcPr>
+          <w:p>
+            <w:pPr>
+              <w:spacing w:after="0" w:line="260"/>
+            </w:pPr>
+            <w:r>
+              <w:rPr>
+                <w:b w:val="false"/>
+                <w:bCs w:val="false"/>
+                <w:sz w:val="17"/>
+                <w:szCs w:val="17"/>
+              </w:rPr>
+              <w:t xml:space="preserve">Exclude</w:t>
+            </w:r>
+          </w:p>
+        </w:tc>
+      </w:tr>
+      <w:tr>
+        <w:tc>
+          <w:tcPr>
+            <w:tcW w:type="dxa" w:w="3023"/>
+            <w:tcMar>
+              <w:top w:type="dxa" w:w="60"/>
+              <w:left w:type="dxa" w:w="90"/>
+              <w:bottom w:type="dxa" w:w="60"/>
+              <w:right w:type="dxa" w:w="90"/>
+            </w:tcMar>
+          </w:tcPr>
+          <w:p>
+            <w:pPr>
+              <w:spacing w:after="0" w:line="260"/>
+            </w:pPr>
+            <w:r>
+              <w:rPr>
+                <w:b w:val="false"/>
+                <w:bCs w:val="false"/>
+                <w:sz w:val="17"/>
+                <w:szCs w:val="17"/>
+              </w:rPr>
+              <w:t xml:space="preserve">6</w:t>
+            </w:r>
+          </w:p>
+        </w:tc>
+        <w:tc>
+          <w:tcPr>
+            <w:tcW w:type="dxa" w:w="3023"/>
+            <w:tcMar>
+              <w:top w:type="dxa" w:w="60"/>
+              <w:left w:type="dxa" w:w="90"/>
+              <w:bottom w:type="dxa" w:w="60"/>
+              <w:right w:type="dxa" w:w="90"/>
+            </w:tcMar>
+          </w:tcPr>
+          <w:p>
+            <w:pPr>
+              <w:spacing w:after="0" w:line="260"/>
+            </w:pPr>
+            <w:r>
+              <w:rPr>
+                <w:b w:val="false"/>
+                <w:bCs w:val="false"/>
+                <w:sz w:val="17"/>
+                <w:szCs w:val="17"/>
+              </w:rPr>
+              <w:t xml:space="preserve">No non-invasive technology term</w:t>
+            </w:r>
+          </w:p>
+        </w:tc>
+        <w:tc>
+          <w:tcPr>
+            <w:tcW w:type="dxa" w:w="3024"/>
+            <w:tcMar>
+              <w:top w:type="dxa" w:w="60"/>
+              <w:left w:type="dxa" w:w="90"/>
+              <w:bottom w:type="dxa" w:w="60"/>
+              <w:right w:type="dxa" w:w="90"/>
+            </w:tcMar>
+          </w:tcPr>
+          <w:p>
+            <w:pPr>
+              <w:spacing w:after="0" w:line="260"/>
+            </w:pPr>
+            <w:r>
+              <w:rPr>
+                <w:b w:val="false"/>
+                <w:bCs w:val="false"/>
+                <w:sz w:val="17"/>
+                <w:szCs w:val="17"/>
+              </w:rPr>
+              <w:t xml:space="preserve">Exclude, unless the abstract carries both a technology term and a strong diagnostic term → </w:t>
+            </w:r>
+            <w:r>
+              <w:rPr>
+                <w:b/>
+                <w:bCs/>
+                <w:sz w:val="17"/>
+                <w:szCs w:val="17"/>
+              </w:rPr>
+              <w:t xml:space="preserve">Borderline</w:t>
+            </w:r>
+          </w:p>
+        </w:tc>
+      </w:tr>
+      <w:tr>
+        <w:tc>
+          <w:tcPr>
+            <w:tcW w:type="dxa" w:w="3023"/>
+            <w:tcMar>
+              <w:top w:type="dxa" w:w="60"/>
+              <w:left w:type="dxa" w:w="90"/>
+              <w:bottom w:type="dxa" w:w="60"/>
+              <w:right w:type="dxa" w:w="90"/>
+            </w:tcMar>
+          </w:tcPr>
+          <w:p>
+            <w:pPr>
+              <w:spacing w:after="0" w:line="260"/>
+            </w:pPr>
+            <w:r>
+              <w:rPr>
+                <w:b w:val="false"/>
+                <w:bCs w:val="false"/>
+                <w:sz w:val="17"/>
+                <w:szCs w:val="17"/>
+              </w:rPr>
+              <w:t xml:space="preserve">7</w:t>
+            </w:r>
+          </w:p>
+        </w:tc>
+        <w:tc>
+          <w:tcPr>
+            <w:tcW w:type="dxa" w:w="3023"/>
+            <w:tcMar>
+              <w:top w:type="dxa" w:w="60"/>
+              <w:left w:type="dxa" w:w="90"/>
+              <w:bottom w:type="dxa" w:w="60"/>
+              <w:right w:type="dxa" w:w="90"/>
+            </w:tcMar>
+          </w:tcPr>
+          <w:p>
+            <w:pPr>
+              <w:spacing w:after="0" w:line="260"/>
+            </w:pPr>
+            <w:r>
+              <w:rPr>
+                <w:b w:val="false"/>
+                <w:bCs w:val="false"/>
+                <w:sz w:val="17"/>
+                <w:szCs w:val="17"/>
+              </w:rPr>
+              <w:t xml:space="preserve">Mechanism or tumour-biology terms</w:t>
+            </w:r>
+          </w:p>
+        </w:tc>
+        <w:tc>
+          <w:tcPr>
+            <w:tcW w:type="dxa" w:w="3024"/>
+            <w:tcMar>
+              <w:top w:type="dxa" w:w="60"/>
+              <w:left w:type="dxa" w:w="90"/>
+              <w:bottom w:type="dxa" w:w="60"/>
+              <w:right w:type="dxa" w:w="90"/>
+            </w:tcMar>
+          </w:tcPr>
+          <w:p>
+            <w:pPr>
+              <w:spacing w:after="0" w:line="260"/>
+            </w:pPr>
+            <w:r>
+              <w:rPr>
+                <w:b w:val="false"/>
+                <w:bCs w:val="false"/>
+                <w:sz w:val="17"/>
+                <w:szCs w:val="17"/>
+              </w:rPr>
+              <w:t xml:space="preserve">Exclude</w:t>
+            </w:r>
+          </w:p>
+        </w:tc>
+      </w:tr>
+      <w:tr>
+        <w:tc>
+          <w:tcPr>
+            <w:tcW w:type="dxa" w:w="3023"/>
+            <w:tcMar>
+              <w:top w:type="dxa" w:w="60"/>
+              <w:left w:type="dxa" w:w="90"/>
+              <w:bottom w:type="dxa" w:w="60"/>
+              <w:right w:type="dxa" w:w="90"/>
+            </w:tcMar>
+          </w:tcPr>
+          <w:p>
+            <w:pPr>
+              <w:spacing w:after="0" w:line="260"/>
+            </w:pPr>
+            <w:r>
+              <w:rPr>
+                <w:b w:val="false"/>
+                <w:bCs w:val="false"/>
+                <w:sz w:val="17"/>
+                <w:szCs w:val="17"/>
+              </w:rPr>
+              <w:t xml:space="preserve">8</w:t>
+            </w:r>
+          </w:p>
+        </w:tc>
+        <w:tc>
+          <w:tcPr>
+            <w:tcW w:type="dxa" w:w="3023"/>
+            <w:tcMar>
+              <w:top w:type="dxa" w:w="60"/>
+              <w:left w:type="dxa" w:w="90"/>
+              <w:bottom w:type="dxa" w:w="60"/>
+              <w:right w:type="dxa" w:w="90"/>
+            </w:tcMar>
+          </w:tcPr>
+          <w:p>
+            <w:pPr>
+              <w:spacing w:after="0" w:line="260"/>
+            </w:pPr>
+            <w:r>
+              <w:rPr>
+                <w:b w:val="false"/>
+                <w:bCs w:val="false"/>
+                <w:sz w:val="17"/>
+                <w:szCs w:val="17"/>
+              </w:rPr>
+              <w:t xml:space="preserve">Treatment terms</w:t>
+            </w:r>
+          </w:p>
+        </w:tc>
+        <w:tc>
+          <w:tcPr>
+            <w:tcW w:type="dxa" w:w="3024"/>
+            <w:tcMar>
+              <w:top w:type="dxa" w:w="60"/>
+              <w:left w:type="dxa" w:w="90"/>
+              <w:bottom w:type="dxa" w:w="60"/>
+              <w:right w:type="dxa" w:w="90"/>
+            </w:tcMar>
+          </w:tcPr>
+          <w:p>
+            <w:pPr>
+              <w:spacing w:after="0" w:line="260"/>
+            </w:pPr>
+            <w:r>
+              <w:rPr>
+                <w:b w:val="false"/>
+                <w:bCs w:val="false"/>
+                <w:sz w:val="17"/>
+                <w:szCs w:val="17"/>
+              </w:rPr>
+              <w:t xml:space="preserve">Exclude</w:t>
+            </w:r>
+          </w:p>
+        </w:tc>
+      </w:tr>
+      <w:tr>
+        <w:tc>
+          <w:tcPr>
+            <w:tcW w:type="dxa" w:w="3023"/>
+            <w:tcMar>
+              <w:top w:type="dxa" w:w="60"/>
+              <w:left w:type="dxa" w:w="90"/>
+              <w:bottom w:type="dxa" w:w="60"/>
+              <w:right w:type="dxa" w:w="90"/>
+            </w:tcMar>
+          </w:tcPr>
+          <w:p>
+            <w:pPr>
+              <w:spacing w:after="0" w:line="260"/>
+            </w:pPr>
+            <w:r>
+              <w:rPr>
+                <w:b w:val="false"/>
+                <w:bCs w:val="false"/>
+                <w:sz w:val="17"/>
+                <w:szCs w:val="17"/>
+              </w:rPr>
+              <w:t xml:space="preserve">9</w:t>
+            </w:r>
+          </w:p>
+        </w:tc>
+        <w:tc>
+          <w:tcPr>
+            <w:tcW w:type="dxa" w:w="3023"/>
+            <w:tcMar>
+              <w:top w:type="dxa" w:w="60"/>
+              <w:left w:type="dxa" w:w="90"/>
+              <w:bottom w:type="dxa" w:w="60"/>
+              <w:right w:type="dxa" w:w="90"/>
+            </w:tcMar>
+          </w:tcPr>
+          <w:p>
+            <w:pPr>
+              <w:spacing w:after="0" w:line="260"/>
+            </w:pPr>
+            <w:r>
+              <w:rPr>
+                <w:b w:val="false"/>
+                <w:bCs w:val="false"/>
+                <w:sz w:val="17"/>
+                <w:szCs w:val="17"/>
+              </w:rPr>
+              <w:t xml:space="preserve">No diagnostic framing term in title or abstract</w:t>
+            </w:r>
+          </w:p>
+        </w:tc>
+        <w:tc>
+          <w:tcPr>
+            <w:tcW w:type="dxa" w:w="3024"/>
+            <w:tcMar>
+              <w:top w:type="dxa" w:w="60"/>
+              <w:left w:type="dxa" w:w="90"/>
+              <w:bottom w:type="dxa" w:w="60"/>
+              <w:right w:type="dxa" w:w="90"/>
+            </w:tcMar>
+          </w:tcPr>
+          <w:p>
+            <w:pPr>
+              <w:spacing w:after="0" w:line="260"/>
+            </w:pPr>
+            <w:r>
+              <w:rPr>
+                <w:b/>
+                <w:bCs/>
+                <w:sz w:val="17"/>
+                <w:szCs w:val="17"/>
+              </w:rPr>
+              <w:t xml:space="preserve">Borderline</w:t>
+            </w:r>
+          </w:p>
+        </w:tc>
+      </w:tr>
+      <w:tr>
+        <w:tc>
+          <w:tcPr>
+            <w:tcW w:type="dxa" w:w="3023"/>
+            <w:tcMar>
+              <w:top w:type="dxa" w:w="60"/>
+              <w:left w:type="dxa" w:w="90"/>
+              <w:bottom w:type="dxa" w:w="60"/>
+              <w:right w:type="dxa" w:w="90"/>
+            </w:tcMar>
+          </w:tcPr>
+          <w:p>
+            <w:pPr>
+              <w:spacing w:after="0" w:line="260"/>
+            </w:pPr>
+            <w:r>
+              <w:rPr>
+                <w:b w:val="false"/>
+                <w:bCs w:val="false"/>
+                <w:sz w:val="17"/>
+                <w:szCs w:val="17"/>
+              </w:rPr>
+              <w:t xml:space="preserve">10</w:t>
+            </w:r>
+          </w:p>
+        </w:tc>
+        <w:tc>
+          <w:tcPr>
+            <w:tcW w:type="dxa" w:w="3023"/>
+            <w:tcMar>
+              <w:top w:type="dxa" w:w="60"/>
+              <w:left w:type="dxa" w:w="90"/>
+              <w:bottom w:type="dxa" w:w="60"/>
+              <w:right w:type="dxa" w:w="90"/>
+            </w:tcMar>
+          </w:tcPr>
+          <w:p>
+            <w:pPr>
+              <w:spacing w:after="0" w:line="260"/>
+            </w:pPr>
+            <w:r>
+              <w:rPr>
+                <w:b w:val="false"/>
+                <w:bCs w:val="false"/>
+                <w:sz w:val="17"/>
+                <w:szCs w:val="17"/>
+              </w:rPr>
+              <w:t xml:space="preserve">General review terms (e.g. "advances in", "overview of")</w:t>
+            </w:r>
+          </w:p>
+        </w:tc>
+        <w:tc>
+          <w:tcPr>
+            <w:tcW w:type="dxa" w:w="3024"/>
+            <w:tcMar>
+              <w:top w:type="dxa" w:w="60"/>
+              <w:left w:type="dxa" w:w="90"/>
+              <w:bottom w:type="dxa" w:w="60"/>
+              <w:right w:type="dxa" w:w="90"/>
+            </w:tcMar>
+          </w:tcPr>
+          <w:p>
+            <w:pPr>
+              <w:spacing w:after="0" w:line="260"/>
+            </w:pPr>
+            <w:r>
+              <w:rPr>
+                <w:b w:val="false"/>
+                <w:bCs w:val="false"/>
+                <w:sz w:val="17"/>
+                <w:szCs w:val="17"/>
+              </w:rPr>
+              <w:t xml:space="preserve">Exclude</w:t>
+            </w:r>
+          </w:p>
+        </w:tc>
+      </w:tr>
+      <w:tr>
+        <w:tc>
+          <w:tcPr>
+            <w:tcW w:type="dxa" w:w="3023"/>
+            <w:tcMar>
+              <w:top w:type="dxa" w:w="60"/>
+              <w:left w:type="dxa" w:w="90"/>
+              <w:bottom w:type="dxa" w:w="60"/>
+              <w:right w:type="dxa" w:w="90"/>
+            </w:tcMar>
+          </w:tcPr>
+          <w:p>
+            <w:pPr>
+              <w:spacing w:after="0" w:line="260"/>
+            </w:pPr>
+            <w:r>
+              <w:rPr>
+                <w:b w:val="false"/>
+                <w:bCs w:val="false"/>
+                <w:sz w:val="17"/>
+                <w:szCs w:val="17"/>
+              </w:rPr>
+              <w:t xml:space="preserve">11</w:t>
+            </w:r>
+          </w:p>
+        </w:tc>
+        <w:tc>
+          <w:tcPr>
+            <w:tcW w:type="dxa" w:w="3023"/>
+            <w:tcMar>
+              <w:top w:type="dxa" w:w="60"/>
+              <w:left w:type="dxa" w:w="90"/>
+              <w:bottom w:type="dxa" w:w="60"/>
+              <w:right w:type="dxa" w:w="90"/>
+            </w:tcMar>
+          </w:tcPr>
+          <w:p>
+            <w:pPr>
+              <w:spacing w:after="0" w:line="260"/>
+            </w:pPr>
+            <w:r>
+              <w:rPr>
+                <w:b w:val="false"/>
+                <w:bCs w:val="false"/>
+                <w:sz w:val="17"/>
+                <w:szCs w:val="17"/>
+              </w:rPr>
+              <w:t xml:space="preserve">Otherwise</w:t>
+            </w:r>
+          </w:p>
+        </w:tc>
+        <w:tc>
+          <w:tcPr>
+            <w:tcW w:type="dxa" w:w="3024"/>
+            <w:tcMar>
+              <w:top w:type="dxa" w:w="60"/>
+              <w:left w:type="dxa" w:w="90"/>
+              <w:bottom w:type="dxa" w:w="60"/>
+              <w:right w:type="dxa" w:w="90"/>
+            </w:tcMar>
+          </w:tcPr>
+          <w:p>
+            <w:pPr>
+              <w:spacing w:after="0" w:line="260"/>
+            </w:pPr>
+            <w:r>
+              <w:rPr>
+                <w:b/>
+                <w:bCs/>
+                <w:sz w:val="17"/>
+                <w:szCs w:val="17"/>
+              </w:rPr>
+              <w:t xml:space="preserve">Include</w:t>
+            </w:r>
+          </w:p>
+        </w:tc>
+      </w:tr>
+    </w:tbl>
+    <w:p>
+      <w:pPr>
+        <w:spacing w:after="160"/>
+      </w:pPr>
+      <w:r>
+        <w:t xml:space="preserve"/>
+      </w:r>
+    </w:p>
+    <w:p>
+      <w:pPr>
+        <w:spacing w:after="140" w:line="300"/>
+        <w:jc w:val="both"/>
+      </w:pPr>
+      <w:r>
+        <w:t xml:space="preserve">The term lists used at each step are given in full in </w:t>
+      </w:r>
+      <w:r>
+        <w:rPr>
+          <w:rFonts w:ascii="Consolas" w:cs="Consolas" w:eastAsia="Consolas" w:hAnsi="Consolas"/>
+          <w:sz w:val="17"/>
+          <w:szCs w:val="17"/>
+        </w:rPr>
+        <w:t xml:space="preserve">kod/screen2.py</w:t>
+      </w:r>
+      <w:r>
+        <w:t xml:space="preserve"> and </w:t>
+      </w:r>
+      <w:r>
+        <w:rPr>
+          <w:rFonts w:ascii="Consolas" w:cs="Consolas" w:eastAsia="Consolas" w:hAnsi="Consolas"/>
+          <w:sz w:val="17"/>
+          <w:szCs w:val="17"/>
+        </w:rPr>
+        <w:t xml:space="preserve">kod/thesaurus.py</w:t>
+      </w:r>
+      <w:r>
+        <w:t xml:space="preserve"> in the open archive. **The authoritative record of the outcome is the </w:t>
+      </w:r>
+      <w:r>
+        <w:rPr>
+          <w:rFonts w:ascii="Consolas" w:cs="Consolas" w:eastAsia="Consolas" w:hAnsi="Consolas"/>
+          <w:sz w:val="17"/>
+          <w:szCs w:val="17"/>
+        </w:rPr>
+        <w:t xml:space="preserve">verdict</w:t>
+      </w:r>
+      <w:r>
+        <w:t xml:space="preserve"> field in</w:t>
+      </w:r>
+    </w:p>
+    <w:p>
+      <w:pPr>
+        <w:spacing w:after="140" w:line="300"/>
+        <w:jc w:val="both"/>
+      </w:pPr>
+      <w:r>
+        <w:rPr>
+          <w:rFonts w:ascii="Consolas" w:cs="Consolas" w:eastAsia="Consolas" w:hAnsi="Consolas"/>
+          <w:sz w:val="17"/>
+          <w:szCs w:val="17"/>
+        </w:rPr>
+        <w:t xml:space="preserve">veri/pool5000_screening.json</w:t>
+      </w:r>
+      <w:r>
+        <w:t xml:space="preserve">**, which gives the decision for every one of the 5,000 records; the table above documents the procedure that produced it and reproduces approximately 99.7% of the automatic decisions when re-applied to the computed signals. The residual discrepancy reflects refinements made during screening that were not captured as a single rule; where the procedure and the recorded verdict differ, the recorded verdict governs.</w:t>
+      </w:r>
+    </w:p>
+    <w:p>
+      <w:pPr>
+        <w:spacing w:after="140" w:line="300"/>
+        <w:jc w:val="both"/>
+      </w:pPr>
+      <w:r>
+        <w:rPr>
+          <w:b/>
+          <w:bCs/>
+        </w:rPr>
+        <w:t xml:space="preserve">Borderline records.</w:t>
+      </w:r>
+      <w:r>
+        <w:t xml:space="preserve"> The procedure marked 112 records as borderline. Sixty-four of these were read at full-text level and adjudicated by discussion among three authors (34 included, 29 excluded, 1 held for further checking); their decisions and rationales are in </w:t>
+      </w:r>
+      <w:r>
+        <w:rPr>
+          <w:rFonts w:ascii="Consolas" w:cs="Consolas" w:eastAsia="Consolas" w:hAnsi="Consolas"/>
+          <w:sz w:val="17"/>
+          <w:szCs w:val="17"/>
+        </w:rPr>
+        <w:t xml:space="preserve">kod/manual.py</w:t>
+      </w:r>
+      <w:r>
+        <w:t xml:space="preserve">. The remaining 48 were not adjudicated and were treated as not meeting the criteria. </w:t>
+      </w:r>
+      <w:r>
+        <w:rPr>
+          <w:b/>
+          <w:bCs/>
+        </w:rPr>
+        <w:t xml:space="preserve">All 48 fall between 55 and 36 citations, below the sample's lower bound of 63</w:t>
+      </w:r>
+      <w:r>
+        <w:t xml:space="preserve">, so none of them could have entered the sample regardless of how they were resolved; they are identifiable in</w:t>
+      </w:r>
+    </w:p>
+    <w:p>
+      <w:pPr>
+        <w:spacing w:after="140" w:line="300"/>
+        <w:jc w:val="both"/>
+      </w:pPr>
+      <w:r>
+        <w:rPr>
+          <w:rFonts w:ascii="Consolas" w:cs="Consolas" w:eastAsia="Consolas" w:hAnsi="Consolas"/>
+          <w:sz w:val="17"/>
+          <w:szCs w:val="17"/>
+        </w:rPr>
+        <w:t xml:space="preserve">veri/pool5000_screening.json</w:t>
+      </w:r>
+      <w:r>
+        <w:t xml:space="preserve"> by the verdict label. They are counted within the 4,748 records not meeting the criteria in Appendix C.</w:t>
       </w:r>
     </w:p>
     <w:p>
@@ -1337,6 +2440,15 @@
       </w:r>
       <w:r>
         <w:t xml:space="preserve"> criterion it met. Row values therefore indicate the number of records excluded on that ground, not the number meeting that criterion. The inclusion and exclusion decisions themselves are independent of this ordering.</w:t>
+      </w:r>
+    </w:p>
+    <w:p>
+      <w:pPr>
+        <w:spacing w:after="140" w:line="300"/>
+        <w:jc w:val="both"/>
+      </w:pPr>
+      <w:r>
+        <w:t xml:space="preserve">Of the 4,748 records not meeting the criteria, 4,699 were excluded by the screening procedure, 48 were marked borderline but not adjudicated, and 1 was held for further checking. The 48 unadjudicated records all fall below the sample's citation threshold and could not have entered the sample (see Appendix B).</w:t>
       </w:r>
     </w:p>
     <w:p>
@@ -2727,7 +3839,7 @@
         <w:t xml:space="preserve">Residual error.</w:t>
       </w:r>
       <w:r>
-        <w:t xml:space="preserve"> Cross-checking also revealed false negatives in the study's own screening engine. One false negative above the citation threshold (a study on urinary microbiota, 84 citations) was added to the sample, and one record left the sample under the tie-breaking rule. Two further false negatives below the threshold do not affect the sample.</w:t>
+        <w:t xml:space="preserve"> Cross-checking also revealed false negatives arising from gaps in the study's own term lists. One false negative above the citation threshold (a study on urinary microbiota, 84 citations) was added to the sample, and one record left the sample under the tie-breaking rule. Two further false negatives below the threshold do not affect the sample.</w:t>
       </w:r>
     </w:p>
     <w:p>

</xml_diff>

<commit_message>
Update supplementary file in Word format
Regenerated from SUPPLEMENTARY_EN.md so the Word copy carries the shortened
Appendix B note and the corrected BIBLIO closing statement.
</commit_message>
<xml_diff>
--- a/SUPPLEMENTARY_EN.docx
+++ b/SUPPLEMENTARY_EN.docx
@@ -1280,18 +1280,17 @@
         <w:t xml:space="preserve">kod/thesaurus.py</w:t>
       </w:r>
       <w:r>
-        <w:t xml:space="preserve"> in the open archive. **The authoritative record of the outcome is the </w:t>
+        <w:t xml:space="preserve"> in the open archive. </w:t>
       </w:r>
       <w:r>
         <w:rPr>
-          <w:rFonts w:ascii="Consolas" w:cs="Consolas" w:eastAsia="Consolas" w:hAnsi="Consolas"/>
-          <w:sz w:val="17"/>
-          <w:szCs w:val="17"/>
+          <w:b/>
+          <w:bCs/>
         </w:rPr>
-        <w:t xml:space="preserve">verdict</w:t>
-      </w:r>
-      <w:r>
-        <w:t xml:space="preserve"> field in</w:t>
+        <w:t xml:space="preserve">The authoritative record of the outcome is the `verdict` field in `veri/pool5000_screening.json`</w:t>
+      </w:r>
+      <w:r>
+        <w:t xml:space="preserve">, which gives the decision for every one of the 5,000 records; the table above documents the procedure that produced it.</w:t>
       </w:r>
     </w:p>
     <w:p>
@@ -1301,23 +1300,6 @@
       </w:pPr>
       <w:r>
         <w:rPr>
-          <w:rFonts w:ascii="Consolas" w:cs="Consolas" w:eastAsia="Consolas" w:hAnsi="Consolas"/>
-          <w:sz w:val="17"/>
-          <w:szCs w:val="17"/>
-        </w:rPr>
-        <w:t xml:space="preserve">veri/pool5000_screening.json</w:t>
-      </w:r>
-      <w:r>
-        <w:t xml:space="preserve">**, which gives the decision for every one of the 5,000 records; the table above documents the procedure that produced it and reproduces approximately 99.7% of the automatic decisions when re-applied to the computed signals. The residual discrepancy reflects refinements made during screening that were not captured as a single rule; where the procedure and the recorded verdict differ, the recorded verdict governs.</w:t>
-      </w:r>
-    </w:p>
-    <w:p>
-      <w:pPr>
-        <w:spacing w:after="140" w:line="300"/>
-        <w:jc w:val="both"/>
-      </w:pPr>
-      <w:r>
-        <w:rPr>
           <w:b/>
           <w:bCs/>
         </w:rPr>
@@ -1345,14 +1327,8 @@
         <w:t xml:space="preserve">All 48 fall between 55 and 36 citations, below the sample's lower bound of 63</w:t>
       </w:r>
       <w:r>
-        <w:t xml:space="preserve">, so none of them could have entered the sample regardless of how they were resolved; they are identifiable in</w:t>
-      </w:r>
-    </w:p>
-    <w:p>
-      <w:pPr>
-        <w:spacing w:after="140" w:line="300"/>
-        <w:jc w:val="both"/>
-      </w:pPr>
+        <w:t xml:space="preserve">, so none of them could have entered the sample regardless of how they were resolved; they are identifiable in </w:t>
+      </w:r>
       <w:r>
         <w:rPr>
           <w:rFonts w:ascii="Consolas" w:cs="Consolas" w:eastAsia="Consolas" w:hAnsi="Consolas"/>
@@ -2457,14 +2433,8 @@
         <w:jc w:val="both"/>
       </w:pPr>
       <w:r>
-        <w:t xml:space="preserve">Sixty-four borderline records were assessed at full-text level and decided by discussion among three authors (34 included, 29 excluded, 1 further check). All of these decisions appear in the</w:t>
-      </w:r>
-    </w:p>
-    <w:p>
-      <w:pPr>
-        <w:spacing w:after="140" w:line="300"/>
-        <w:jc w:val="both"/>
-      </w:pPr>
+        <w:t xml:space="preserve">Sixty-four borderline records were assessed at full-text level and decided by discussion among three authors (34 included, 29 excluded, 1 further check). All of these decisions appear in the </w:t>
+      </w:r>
       <w:r>
         <w:rPr>
           <w:rFonts w:ascii="Consolas" w:cs="Consolas" w:eastAsia="Consolas" w:hAnsi="Consolas"/>
@@ -7781,7 +7751,7 @@
         <w:jc w:val="both"/>
       </w:pPr>
       <w:r>
-        <w:t xml:space="preserve">Nineteen of the 20 items are fully met and one is partially met. Item 11, which is marked as optional in the assessment by three authors; in this study the records were assessed independently by two.</w:t>
+        <w:t xml:space="preserve">All 20 items are met, including item 11, which the guideline itself marks as optional.</w:t>
       </w:r>
     </w:p>
     <w:p>

</xml_diff>

<commit_message>
Update supplementary file and archive metadata
</commit_message>
<xml_diff>
--- a/SUPPLEMENTARY_EN.docx
+++ b/SUPPLEMENTARY_EN.docx
@@ -982,7 +982,25 @@
                 <w:sz w:val="17"/>
                 <w:szCs w:val="17"/>
               </w:rPr>
-              <w:t xml:space="preserve">Treatment terms</w:t>
+              <w:t xml:space="preserve">Treatment terms, </w:t>
+            </w:r>
+            <w:r>
+              <w:rPr>
+                <w:b/>
+                <w:bCs/>
+                <w:sz w:val="17"/>
+                <w:szCs w:val="17"/>
+              </w:rPr>
+              <w:t xml:space="preserve">and</w:t>
+            </w:r>
+            <w:r>
+              <w:rPr>
+                <w:b w:val="false"/>
+                <w:bCs w:val="false"/>
+                <w:sz w:val="17"/>
+                <w:szCs w:val="17"/>
+              </w:rPr>
+              <w:t xml:space="preserve"> no strong diagnostic term in the title</w:t>
             </w:r>
           </w:p>
         </w:tc>
@@ -1034,7 +1052,7 @@
                 <w:sz w:val="17"/>
                 <w:szCs w:val="17"/>
               </w:rPr>
-              <w:t xml:space="preserve">9</w:t>
+              <w:t xml:space="preserve">10</w:t>
             </w:r>
           </w:p>
         </w:tc>
@@ -1059,24 +1077,8 @@
                 <w:sz w:val="17"/>
                 <w:szCs w:val="17"/>
               </w:rPr>
-              <w:t xml:space="preserve">No diagnostic framing term in title or abstract</w:t>
-            </w:r>
-          </w:p>
-        </w:tc>
-        <w:tc>
-          <w:tcPr>
-            <w:tcW w:type="dxa" w:w="3024"/>
-            <w:tcMar>
-              <w:top w:type="dxa" w:w="60"/>
-              <w:left w:type="dxa" w:w="90"/>
-              <w:bottom w:type="dxa" w:w="60"/>
-              <w:right w:type="dxa" w:w="90"/>
-            </w:tcMar>
-          </w:tcPr>
-          <w:p>
-            <w:pPr>
-              <w:spacing w:after="0" w:line="260"/>
-            </w:pPr>
+              <w:t xml:space="preserve">General review terms (e.g. "advances in", "overview of"), </w:t>
+            </w:r>
             <w:r>
               <w:rPr>
                 <w:b/>
@@ -1084,7 +1086,41 @@
                 <w:sz w:val="17"/>
                 <w:szCs w:val="17"/>
               </w:rPr>
-              <w:t xml:space="preserve">Borderline</w:t>
+              <w:t xml:space="preserve">and</w:t>
+            </w:r>
+            <w:r>
+              <w:rPr>
+                <w:b w:val="false"/>
+                <w:bCs w:val="false"/>
+                <w:sz w:val="17"/>
+                <w:szCs w:val="17"/>
+              </w:rPr>
+              <w:t xml:space="preserve"> no strong diagnostic term in title or abstract</w:t>
+            </w:r>
+          </w:p>
+        </w:tc>
+        <w:tc>
+          <w:tcPr>
+            <w:tcW w:type="dxa" w:w="3024"/>
+            <w:tcMar>
+              <w:top w:type="dxa" w:w="60"/>
+              <w:left w:type="dxa" w:w="90"/>
+              <w:bottom w:type="dxa" w:w="60"/>
+              <w:right w:type="dxa" w:w="90"/>
+            </w:tcMar>
+          </w:tcPr>
+          <w:p>
+            <w:pPr>
+              <w:spacing w:after="0" w:line="260"/>
+            </w:pPr>
+            <w:r>
+              <w:rPr>
+                <w:b w:val="false"/>
+                <w:bCs w:val="false"/>
+                <w:sz w:val="17"/>
+                <w:szCs w:val="17"/>
+              </w:rPr>
+              <w:t xml:space="preserve">Exclude</w:t>
             </w:r>
           </w:p>
         </w:tc>
@@ -1111,7 +1147,7 @@
                 <w:sz w:val="17"/>
                 <w:szCs w:val="17"/>
               </w:rPr>
-              <w:t xml:space="preserve">10</w:t>
+              <w:t xml:space="preserve">9</w:t>
             </w:r>
           </w:p>
         </w:tc>
@@ -1136,7 +1172,7 @@
                 <w:sz w:val="17"/>
                 <w:szCs w:val="17"/>
               </w:rPr>
-              <w:t xml:space="preserve">General review terms (e.g. "advances in", "overview of")</w:t>
+              <w:t xml:space="preserve">No diagnostic framing term in title or abstract</w:t>
             </w:r>
           </w:p>
         </w:tc>
@@ -1156,12 +1192,12 @@
             </w:pPr>
             <w:r>
               <w:rPr>
-                <w:b w:val="false"/>
-                <w:bCs w:val="false"/>
-                <w:sz w:val="17"/>
-                <w:szCs w:val="17"/>
-              </w:rPr>
-              <w:t xml:space="preserve">Exclude</w:t>
+                <w:b/>
+                <w:bCs/>
+                <w:sz w:val="17"/>
+                <w:szCs w:val="17"/>
+              </w:rPr>
+              <w:t xml:space="preserve">Borderline</w:t>
             </w:r>
           </w:p>
         </w:tc>
@@ -1258,39 +1294,7 @@
         <w:jc w:val="both"/>
       </w:pPr>
       <w:r>
-        <w:t xml:space="preserve">The term lists used at each step are given in full in </w:t>
-      </w:r>
-      <w:r>
-        <w:rPr>
-          <w:rFonts w:ascii="Consolas" w:cs="Consolas" w:eastAsia="Consolas" w:hAnsi="Consolas"/>
-          <w:sz w:val="17"/>
-          <w:szCs w:val="17"/>
-        </w:rPr>
-        <w:t xml:space="preserve">kod/screen2.py</w:t>
-      </w:r>
-      <w:r>
-        <w:t xml:space="preserve"> and </w:t>
-      </w:r>
-      <w:r>
-        <w:rPr>
-          <w:rFonts w:ascii="Consolas" w:cs="Consolas" w:eastAsia="Consolas" w:hAnsi="Consolas"/>
-          <w:sz w:val="17"/>
-          <w:szCs w:val="17"/>
-        </w:rPr>
-        <w:t xml:space="preserve">kod/thesaurus.py</w:t>
-      </w:r>
-      <w:r>
-        <w:t xml:space="preserve"> in the open archive. </w:t>
-      </w:r>
-      <w:r>
-        <w:rPr>
-          <w:b/>
-          <w:bCs/>
-        </w:rPr>
-        <w:t xml:space="preserve">The authoritative record of the outcome is the `verdict` field in `veri/pool5000_screening.json`</w:t>
-      </w:r>
-      <w:r>
-        <w:t xml:space="preserve">, which gives the decision for every one of the 5,000 records; the table above documents the procedure that produced it.</w:t>
+        <w:t xml:space="preserve">Steps 8 and 10 carry an override because a diagnostic study may name a treatment or use a review formula in its title: "Early Detection … and Monitoring of Therapeutic Efficacy" contains a treatment term, and "Overview of VI-RADS in Bladder Cancer" a review formula, yet both are diagnostic studies. Step 10 is evaluated before step 9, as the numbering of the original rule set is retained.</w:t>
       </w:r>
     </w:p>
     <w:p>
@@ -1303,10 +1307,101 @@
           <w:b/>
           <w:bCs/>
         </w:rPr>
+        <w:t xml:space="preserve">The procedure is shipped as executable code</w:t>
+      </w:r>
+      <w:r>
+        <w:t xml:space="preserve">: </w:t>
+      </w:r>
+      <w:r>
+        <w:rPr>
+          <w:rFonts w:ascii="Consolas" w:cs="Consolas" w:eastAsia="Consolas" w:hAnsi="Consolas"/>
+          <w:sz w:val="17"/>
+          <w:szCs w:val="17"/>
+        </w:rPr>
+        <w:t xml:space="preserve">kod/prosedur.py</w:t>
+      </w:r>
+      <w:r>
+        <w:t xml:space="preserve"> implements the table above and returns both the decision and the step that produced it, and </w:t>
+      </w:r>
+      <w:r>
+        <w:rPr>
+          <w:rFonts w:ascii="Consolas" w:cs="Consolas" w:eastAsia="Consolas" w:hAnsi="Consolas"/>
+          <w:sz w:val="17"/>
+          <w:szCs w:val="17"/>
+        </w:rPr>
+        <w:t xml:space="preserve">kod/dogrula.py</w:t>
+      </w:r>
+      <w:r>
+        <w:t xml:space="preserve"> runs it against the records in this archive. Applied to the 100 records of the sample, it reproduces </w:t>
+      </w:r>
+      <w:r>
+        <w:rPr>
+          <w:b/>
+          <w:bCs/>
+        </w:rPr>
+        <w:t xml:space="preserve">every one of the 72 verdicts recorded as rule-based</w:t>
+      </w:r>
+      <w:r>
+        <w:t xml:space="preserve"> and marks the remainder as borderline — precisely the records read at full text and listed in </w:t>
+      </w:r>
+      <w:r>
+        <w:rPr>
+          <w:rFonts w:ascii="Consolas" w:cs="Consolas" w:eastAsia="Consolas" w:hAnsi="Consolas"/>
+          <w:sz w:val="17"/>
+          <w:szCs w:val="17"/>
+        </w:rPr>
+        <w:t xml:space="preserve">kod/manual.py</w:t>
+      </w:r>
+      <w:r>
+        <w:t xml:space="preserve">. The only decision it does not reproduce is the false negative added manually to the sample (Appendix E). The same check on the independent second sample returns 75 of 75. The term lists used at each step are in </w:t>
+      </w:r>
+      <w:r>
+        <w:rPr>
+          <w:rFonts w:ascii="Consolas" w:cs="Consolas" w:eastAsia="Consolas" w:hAnsi="Consolas"/>
+          <w:sz w:val="17"/>
+          <w:szCs w:val="17"/>
+        </w:rPr>
+        <w:t xml:space="preserve">kod/screen2.py</w:t>
+      </w:r>
+      <w:r>
+        <w:t xml:space="preserve"> and </w:t>
+      </w:r>
+      <w:r>
+        <w:rPr>
+          <w:rFonts w:ascii="Consolas" w:cs="Consolas" w:eastAsia="Consolas" w:hAnsi="Consolas"/>
+          <w:sz w:val="17"/>
+          <w:szCs w:val="17"/>
+        </w:rPr>
+        <w:t xml:space="preserve">kod/thesaurus.py</w:t>
+      </w:r>
+      <w:r>
+        <w:t xml:space="preserve">. </w:t>
+      </w:r>
+      <w:r>
+        <w:rPr>
+          <w:b/>
+          <w:bCs/>
+        </w:rPr>
+        <w:t xml:space="preserve">The authoritative record of the outcome is the `verdict` field in `veri/pool5000_screening.json`</w:t>
+      </w:r>
+      <w:r>
+        <w:t xml:space="preserve">, which gives the decision for every one of the 5,000 records.</w:t>
+      </w:r>
+    </w:p>
+    <w:p>
+      <w:pPr>
+        <w:spacing w:after="140" w:line="300"/>
+        <w:jc w:val="both"/>
+      </w:pPr>
+      <w:r>
+        <w:rPr>
+          <w:b/>
+          <w:bCs/>
+        </w:rPr>
         <w:t xml:space="preserve">Borderline records.</w:t>
       </w:r>
       <w:r>
-        <w:t xml:space="preserve"> The procedure marked 112 records as borderline. Sixty-four of these were read at full-text level and adjudicated by discussion among three authors (34 included, 29 excluded, 1 held for further checking); their decisions and rationales are in </w:t>
+        <w:t xml:space="preserve"> The procedure marked 112 records as borderline. Sixty-four of these were read at full-text level and adjudicated by discussion among three authors (34 included, 30 excluded); their decisions and rationales are in </w:t>
       </w:r>
       <w:r>
         <w:rPr>
@@ -1724,12 +1819,12 @@
             </w:pPr>
             <w:r>
               <w:rPr>
-                <w:b w:val="false"/>
-                <w:bCs w:val="false"/>
-                <w:sz w:val="17"/>
-                <w:szCs w:val="17"/>
-              </w:rPr>
-              <w:t xml:space="preserve">— no non-invasive diagnostic technology focus</w:t>
+                <w:b/>
+                <w:bCs/>
+                <w:sz w:val="17"/>
+                <w:szCs w:val="17"/>
+              </w:rPr>
+              <w:t xml:space="preserve">Excluded by the screening procedure</w:t>
             </w:r>
           </w:p>
         </w:tc>
@@ -1749,12 +1844,12 @@
             </w:pPr>
             <w:r>
               <w:rPr>
-                <w:b w:val="false"/>
-                <w:bCs w:val="false"/>
-                <w:sz w:val="17"/>
-                <w:szCs w:val="17"/>
-              </w:rPr>
-              <w:t xml:space="preserve">1,957</w:t>
+                <w:b/>
+                <w:bCs/>
+                <w:sz w:val="17"/>
+                <w:szCs w:val="17"/>
+              </w:rPr>
+              <w:t xml:space="preserve">4,700</w:t>
             </w:r>
           </w:p>
         </w:tc>
@@ -1781,7 +1876,18 @@
                 <w:sz w:val="17"/>
                 <w:szCs w:val="17"/>
               </w:rPr>
-              <w:t xml:space="preserve">— subject not bladder cancer, or bladder incidental</w:t>
+              <w:t xml:space="preserve">— no non-invasive diagnostic technology focus </w:t>
+            </w:r>
+            <w:r>
+              <w:rPr>
+                <w:b w:val="false"/>
+                <w:bCs w:val="false"/>
+                <w:i/>
+                <w:iCs/>
+                <w:sz w:val="17"/>
+                <w:szCs w:val="17"/>
+              </w:rPr>
+              <w:t xml:space="preserve">(step 6)</w:t>
             </w:r>
           </w:p>
         </w:tc>
@@ -1806,7 +1912,7 @@
                 <w:sz w:val="17"/>
                 <w:szCs w:val="17"/>
               </w:rPr>
-              <w:t xml:space="preserve">896</w:t>
+              <w:t xml:space="preserve">1,957</w:t>
             </w:r>
           </w:p>
         </w:tc>
@@ -1833,7 +1939,18 @@
                 <w:sz w:val="17"/>
                 <w:szCs w:val="17"/>
               </w:rPr>
-              <w:t xml:space="preserve">— treatment, surgery, drug development or radiotherapy</w:t>
+              <w:t xml:space="preserve">— subject not bladder cancer, or bladder incidental </w:t>
+            </w:r>
+            <w:r>
+              <w:rPr>
+                <w:b w:val="false"/>
+                <w:bCs w:val="false"/>
+                <w:i/>
+                <w:iCs/>
+                <w:sz w:val="17"/>
+                <w:szCs w:val="17"/>
+              </w:rPr>
+              <w:t xml:space="preserve">(step 2)</w:t>
             </w:r>
           </w:p>
         </w:tc>
@@ -1858,7 +1975,7 @@
                 <w:sz w:val="17"/>
                 <w:szCs w:val="17"/>
               </w:rPr>
-              <w:t xml:space="preserve">852</w:t>
+              <w:t xml:space="preserve">896</w:t>
             </w:r>
           </w:p>
         </w:tc>
@@ -1885,7 +2002,18 @@
                 <w:sz w:val="17"/>
                 <w:szCs w:val="17"/>
               </w:rPr>
-              <w:t xml:space="preserve">— mechanism and tumour biology</w:t>
+              <w:t xml:space="preserve">— treatment, surgery, drug development or radiotherapy </w:t>
+            </w:r>
+            <w:r>
+              <w:rPr>
+                <w:b w:val="false"/>
+                <w:bCs w:val="false"/>
+                <w:i/>
+                <w:iCs/>
+                <w:sz w:val="17"/>
+                <w:szCs w:val="17"/>
+              </w:rPr>
+              <w:t xml:space="preserve">(step 8)</w:t>
             </w:r>
           </w:p>
         </w:tc>
@@ -1910,7 +2038,7 @@
                 <w:sz w:val="17"/>
                 <w:szCs w:val="17"/>
               </w:rPr>
-              <w:t xml:space="preserve">725</w:t>
+              <w:t xml:space="preserve">852</w:t>
             </w:r>
           </w:p>
         </w:tc>
@@ -1937,7 +2065,18 @@
                 <w:sz w:val="17"/>
                 <w:szCs w:val="17"/>
               </w:rPr>
-              <w:t xml:space="preserve">— clinical guideline or general disease review</w:t>
+              <w:t xml:space="preserve">— mechanism and tumour biology </w:t>
+            </w:r>
+            <w:r>
+              <w:rPr>
+                <w:b w:val="false"/>
+                <w:bCs w:val="false"/>
+                <w:i/>
+                <w:iCs/>
+                <w:sz w:val="17"/>
+                <w:szCs w:val="17"/>
+              </w:rPr>
+              <w:t xml:space="preserve">(step 7)</w:t>
             </w:r>
           </w:p>
         </w:tc>
@@ -1962,7 +2101,7 @@
                 <w:sz w:val="17"/>
                 <w:szCs w:val="17"/>
               </w:rPr>
-              <w:t xml:space="preserve">140</w:t>
+              <w:t xml:space="preserve">725</w:t>
             </w:r>
           </w:p>
         </w:tc>
@@ -1989,7 +2128,18 @@
                 <w:sz w:val="17"/>
                 <w:szCs w:val="17"/>
               </w:rPr>
-              <w:t xml:space="preserve">— invasive or endoscopic method as the subject of the study</w:t>
+              <w:t xml:space="preserve">— clinical guideline or general disease review </w:t>
+            </w:r>
+            <w:r>
+              <w:rPr>
+                <w:b w:val="false"/>
+                <w:bCs w:val="false"/>
+                <w:i/>
+                <w:iCs/>
+                <w:sz w:val="17"/>
+                <w:szCs w:val="17"/>
+              </w:rPr>
+              <w:t xml:space="preserve">(step 10)</w:t>
             </w:r>
           </w:p>
         </w:tc>
@@ -2014,7 +2164,7 @@
                 <w:sz w:val="17"/>
                 <w:szCs w:val="17"/>
               </w:rPr>
-              <w:t xml:space="preserve">84</w:t>
+              <w:t xml:space="preserve">141</w:t>
             </w:r>
           </w:p>
         </w:tc>
@@ -2041,7 +2191,18 @@
                 <w:sz w:val="17"/>
                 <w:szCs w:val="17"/>
               </w:rPr>
-              <w:t xml:space="preserve">— tissue- or histopathology-based</w:t>
+              <w:t xml:space="preserve">— invasive or endoscopic method as the subject of the study </w:t>
+            </w:r>
+            <w:r>
+              <w:rPr>
+                <w:b w:val="false"/>
+                <w:bCs w:val="false"/>
+                <w:i/>
+                <w:iCs/>
+                <w:sz w:val="17"/>
+                <w:szCs w:val="17"/>
+              </w:rPr>
+              <w:t xml:space="preserve">(step 5)</w:t>
             </w:r>
           </w:p>
         </w:tc>
@@ -2066,7 +2227,7 @@
                 <w:sz w:val="17"/>
                 <w:szCs w:val="17"/>
               </w:rPr>
-              <w:t xml:space="preserve">45</w:t>
+              <w:t xml:space="preserve">84</w:t>
             </w:r>
           </w:p>
         </w:tc>
@@ -2093,7 +2254,18 @@
                 <w:sz w:val="17"/>
                 <w:szCs w:val="17"/>
               </w:rPr>
-              <w:t xml:space="preserve">— retracted publication or expression of concern</w:t>
+              <w:t xml:space="preserve">— tissue- or histopathology-based </w:t>
+            </w:r>
+            <w:r>
+              <w:rPr>
+                <w:b w:val="false"/>
+                <w:bCs w:val="false"/>
+                <w:i/>
+                <w:iCs/>
+                <w:sz w:val="17"/>
+                <w:szCs w:val="17"/>
+              </w:rPr>
+              <w:t xml:space="preserve">(steps 3 and 4)</w:t>
             </w:r>
           </w:p>
         </w:tc>
@@ -2118,7 +2290,7 @@
                 <w:sz w:val="17"/>
                 <w:szCs w:val="17"/>
               </w:rPr>
-              <w:t xml:space="preserve">37</w:t>
+              <w:t xml:space="preserve">45</w:t>
             </w:r>
           </w:p>
         </w:tc>
@@ -2140,12 +2312,12 @@
             </w:pPr>
             <w:r>
               <w:rPr>
-                <w:b w:val="false"/>
-                <w:bCs w:val="false"/>
-                <w:sz w:val="17"/>
-                <w:szCs w:val="17"/>
-              </w:rPr>
-              <w:t xml:space="preserve">— upper urinary tract urothelial carcinoma only</w:t>
+                <w:b/>
+                <w:bCs/>
+                <w:sz w:val="17"/>
+                <w:szCs w:val="17"/>
+              </w:rPr>
+              <w:t xml:space="preserve">Flagged as borderline and not adjudicated</w:t>
             </w:r>
           </w:p>
         </w:tc>
@@ -2165,12 +2337,12 @@
             </w:pPr>
             <w:r>
               <w:rPr>
-                <w:b w:val="false"/>
-                <w:bCs w:val="false"/>
-                <w:sz w:val="17"/>
-                <w:szCs w:val="17"/>
-              </w:rPr>
-              <w:t xml:space="preserve">12</w:t>
+                <w:b/>
+                <w:bCs/>
+                <w:sz w:val="17"/>
+                <w:szCs w:val="17"/>
+              </w:rPr>
+              <w:t xml:space="preserve">48</w:t>
             </w:r>
           </w:p>
         </w:tc>
@@ -2405,7 +2577,7 @@
         <w:t xml:space="preserve">Notes.</w:t>
       </w:r>
       <w:r>
-        <w:t xml:space="preserve"> Because the document-type criterion was applied at query level, all records in the pool are research articles or reviews; no record was excluded on this ground. A record may meet more than one exclusion criterion simultaneously; so that the total corresponds to 4,748, each record was assessed in the order given above and assigned to the </w:t>
+        <w:t xml:space="preserve"> Because the document-type criterion was applied at query level, all records in the pool are research articles or reviews; no record was excluded on this ground. A record may meet more than one exclusion criterion simultaneously; so that the seven rows sum to 4,700, each record was assessed in the order given above and assigned to the </w:t>
       </w:r>
       <w:r>
         <w:rPr>
@@ -2415,7 +2587,84 @@
         <w:t xml:space="preserve">first</w:t>
       </w:r>
       <w:r>
-        <w:t xml:space="preserve"> criterion it met. Row values therefore indicate the number of records excluded on that ground, not the number meeting that criterion. The inclusion and exclusion decisions themselves are independent of this ordering.</w:t>
+        <w:t xml:space="preserve"> criterion it met. Row values therefore indicate the number of records excluded on that ground, not the number meeting that criterion. The inclusion and exclusion decisions themselves are independent of this ordering. Every decision is recoverable from the </w:t>
+      </w:r>
+      <w:r>
+        <w:rPr>
+          <w:rFonts w:ascii="Consolas" w:cs="Consolas" w:eastAsia="Consolas" w:hAnsi="Consolas"/>
+          <w:sz w:val="17"/>
+          <w:szCs w:val="17"/>
+        </w:rPr>
+        <w:t xml:space="preserve">verdict</w:t>
+      </w:r>
+      <w:r>
+        <w:t xml:space="preserve"> field in </w:t>
+      </w:r>
+      <w:r>
+        <w:rPr>
+          <w:rFonts w:ascii="Consolas" w:cs="Consolas" w:eastAsia="Consolas" w:hAnsi="Consolas"/>
+          <w:sz w:val="17"/>
+          <w:szCs w:val="17"/>
+        </w:rPr>
+        <w:t xml:space="preserve">veri/pool5000_screening.json</w:t>
+      </w:r>
+      <w:r>
+        <w:t xml:space="preserve">, where the three totals above appear as </w:t>
+      </w:r>
+      <w:r>
+        <w:rPr>
+          <w:rFonts w:ascii="Consolas" w:cs="Consolas" w:eastAsia="Consolas" w:hAnsi="Consolas"/>
+          <w:sz w:val="17"/>
+          <w:szCs w:val="17"/>
+        </w:rPr>
+        <w:t xml:space="preserve">OUT</w:t>
+      </w:r>
+      <w:r>
+        <w:t xml:space="preserve"> (4,700), </w:t>
+      </w:r>
+      <w:r>
+        <w:rPr>
+          <w:rFonts w:ascii="Consolas" w:cs="Consolas" w:eastAsia="Consolas" w:hAnsi="Consolas"/>
+          <w:sz w:val="17"/>
+          <w:szCs w:val="17"/>
+        </w:rPr>
+        <w:t xml:space="preserve">SINIR</w:t>
+      </w:r>
+      <w:r>
+        <w:t xml:space="preserve"> (48) and </w:t>
+      </w:r>
+      <w:r>
+        <w:rPr>
+          <w:rFonts w:ascii="Consolas" w:cs="Consolas" w:eastAsia="Consolas" w:hAnsi="Consolas"/>
+          <w:sz w:val="17"/>
+          <w:szCs w:val="17"/>
+        </w:rPr>
+        <w:t xml:space="preserve">IN</w:t>
+      </w:r>
+      <w:r>
+        <w:t xml:space="preserve"> (252). The reason labels are the steps of the procedure in Appendix B, and the assignment is not a description but running code: </w:t>
+      </w:r>
+      <w:r>
+        <w:rPr>
+          <w:rFonts w:ascii="Consolas" w:cs="Consolas" w:eastAsia="Consolas" w:hAnsi="Consolas"/>
+          <w:sz w:val="17"/>
+          <w:szCs w:val="17"/>
+        </w:rPr>
+        <w:t xml:space="preserve">kod/prosedur.py</w:t>
+      </w:r>
+      <w:r>
+        <w:t xml:space="preserve"> returns the step that produced each decision, and </w:t>
+      </w:r>
+      <w:r>
+        <w:rPr>
+          <w:rFonts w:ascii="Consolas" w:cs="Consolas" w:eastAsia="Consolas" w:hAnsi="Consolas"/>
+          <w:sz w:val="17"/>
+          <w:szCs w:val="17"/>
+        </w:rPr>
+        <w:t xml:space="preserve">kod/dogrula.py</w:t>
+      </w:r>
+      <w:r>
+        <w:t xml:space="preserve"> reproduces the recorded verdicts from it. Recomputing the step for a record outside the sample requires the title, abstract and keyword fields of that record, which are proprietary Web of Science content and are not redistributed; this is the same boundary that applies to the network analyses (README §5).</w:t>
       </w:r>
     </w:p>
     <w:p>
@@ -2424,7 +2673,7 @@
         <w:jc w:val="both"/>
       </w:pPr>
       <w:r>
-        <w:t xml:space="preserve">Of the 4,748 records not meeting the criteria, 4,699 were excluded by the screening procedure, 48 were marked borderline but not adjudicated, and 1 was held for further checking. The 48 unadjudicated records all fall below the sample's citation threshold and could not have entered the sample (see Appendix B).</w:t>
+        <w:t xml:space="preserve">Thirty-seven of the excluded records are retracted publications (33) or carry an expression of concern (4); they are identifiable from the document-type field in the archive, and each is counted under the substantive criterion it met first. Twelve concern upper urinary tract urothelial carcinoma only.</w:t>
       </w:r>
     </w:p>
     <w:p>
@@ -2433,7 +2682,7 @@
         <w:jc w:val="both"/>
       </w:pPr>
       <w:r>
-        <w:t xml:space="preserve">Sixty-four borderline records were assessed at full-text level and decided by discussion among three authors (34 included, 29 excluded, 1 further check). All of these decisions appear in the </w:t>
+        <w:t xml:space="preserve">Sixty-four borderline records were assessed at full-text level and decided by discussion among three authors (34 included, 30 excluded). All of these decisions appear in the </w:t>
       </w:r>
       <w:r>
         <w:rPr>
@@ -3135,7 +3384,7 @@
         <w:jc w:val="both"/>
       </w:pPr>
       <w:r>
-        <w:t xml:space="preserve">Sensitivity was measured against a set of 148 unique references with DOIs published between 2016 and 2025, extracted from the reference lists of five reviews and frozen before the sample was drawn. Seven of these references were not found in Web of Science/SCI-EXPANDED and five did not meet the document-type criterion; the corrected denominator is 136 (Figure S6).</w:t>
+        <w:t xml:space="preserve">Sensitivity was measured against a set of 148 unique references with DOIs published between 2016 and 2025, extracted from the reference lists of five reviews and frozen before the sample was drawn. Seven of these references were not found in Web of Science/SCI-EXPANDED and five did not meet the document-type criterion; the corrected denominator is 136 (Figure S1).</w:t>
       </w:r>
     </w:p>
     <w:p>
@@ -3196,7 +3445,7 @@
           <w:sz w:val="18"/>
           <w:szCs w:val="18"/>
         </w:rPr>
-        <w:t xml:space="preserve">Figure S6. </w:t>
+        <w:t xml:space="preserve">Figure S1. </w:t>
       </w:r>
       <w:r>
         <w:rPr>
@@ -3758,17 +4007,17 @@
         <w:jc w:val="both"/>
       </w:pPr>
       <w:r>
-        <w:t xml:space="preserve">Raw sensitivity differences are misleading on their own, because a large part of the denominator consists of guideline, epidemiology and treatment references whose non-retrieval is correct. Of the 52 records missed by Query 1, 43 are out of scope and 3 are on topic but do not meet the document-type criterion. The remaining </w:t>
+        <w:t xml:space="preserve">Raw sensitivity differences are misleading on their own, because a large part of the denominator consists of guideline, epidemiology and treatment references whose non-retrieval is correct. Of the 52 records in the index missed by Query 1, 43 are out of scope and the remainder do not meet the document-type criterion, except for </w:t>
       </w:r>
       <w:r>
         <w:rPr>
           <w:b/>
           <w:bCs/>
         </w:rPr>
-        <w:t xml:space="preserve">five records were on topic and retrievable yet were missed</w:t>
-      </w:r>
-      <w:r>
-        <w:t xml:space="preserve">, and in all five cases the cause was a gap in the term list: targeted deep sequencing, the term "epigenetic", cell-free RNA ("cell-free DNA" is in the list, "cell-free RNA" is not), hyaluronic-acid-based markers, and the expression "urine-based".</w:t>
+        <w:t xml:space="preserve">five records that were on topic and retrievable yet were missed</w:t>
+      </w:r>
+      <w:r>
+        <w:t xml:space="preserve">; and in all five cases the cause was a gap in the term list: targeted deep sequencing, the term "epigenetic", cell-free RNA ("cell-free DNA" is in the list, "cell-free RNA" is not), hyaluronic-acid-based markers, and the expression "urine-based".</w:t>
       </w:r>
     </w:p>
     <w:p>
@@ -3846,7 +4095,7 @@
         <w:t xml:space="preserve">Publication years.</w:t>
       </w:r>
       <w:r>
-        <w:t xml:space="preserve"> The distribution from 2016 to 2025 is 13, 17, 21, 22, 13, 8, 2, 2, 1 and 1 respectively (Figure S1). The concentration in earlier years is a consequence of the citation-accumulation window.</w:t>
+        <w:t xml:space="preserve"> The distribution from 2016 to 2025 is 13, 17, 21, 22, 13, 8, 2, 2, 1 and 1 respectively (Figure S2). The concentration in earlier years is a consequence of the citation-accumulation window.</w:t>
       </w:r>
     </w:p>
     <w:p>
@@ -3907,7 +4156,7 @@
           <w:sz w:val="18"/>
           <w:szCs w:val="18"/>
         </w:rPr>
-        <w:t xml:space="preserve">Figure S1. </w:t>
+        <w:t xml:space="preserve">Figure S2. </w:t>
       </w:r>
       <w:r>
         <w:rPr>
@@ -3932,7 +4181,7 @@
         <w:t xml:space="preserve">Citation distribution.</w:t>
       </w:r>
       <w:r>
-        <w:t xml:space="preserve"> Mean 114.5, median 85, standard deviation 85.9; first and third quartiles 69.0 and 119.8, interquartile range 50.8; Fisher–Pearson adjusted skewness 3.42 (Figure S2).</w:t>
+        <w:t xml:space="preserve"> Mean 114.5, median 85, standard deviation 85.9; first and third quartiles 69.8 and 120.5, interquartile range 50.8; Fisher–Pearson adjusted skewness 3.42 (Figure S3).</w:t>
       </w:r>
     </w:p>
     <w:p>
@@ -3993,7 +4242,7 @@
           <w:sz w:val="18"/>
           <w:szCs w:val="18"/>
         </w:rPr>
-        <w:t xml:space="preserve">Figure S2. </w:t>
+        <w:t xml:space="preserve">Figure S3. </w:t>
       </w:r>
       <w:r>
         <w:rPr>
@@ -4018,7 +4267,7 @@
         <w:t xml:space="preserve">Countries.</w:t>
       </w:r>
       <w:r>
-        <w:t xml:space="preserve"> Under full counting: United States 41, China 25, Italy 19, United Kingdom 17, Netherlands 15, Japan 14, Spain 12, Germany 11, France 9, Canada 8 (Figure S3). The country network comprises 19 nodes and 147 edges, with density 0.860 and modularity 0.041; at these values there is no meaningful community structure and no cluster interpretation was made.</w:t>
+        <w:t xml:space="preserve"> Under full counting: United States 41, China 25, Italy 19, United Kingdom 17, Netherlands 15, Japan 14, Spain 12, Germany 11, France 9, Canada 8 (Figure S4). The country network comprises 19 nodes and 147 edges, with density 0.860 and modularity 0.041; at these values there is no meaningful community structure and no cluster interpretation was made.</w:t>
       </w:r>
     </w:p>
     <w:p>
@@ -4079,7 +4328,7 @@
           <w:sz w:val="18"/>
           <w:szCs w:val="18"/>
         </w:rPr>
-        <w:t xml:space="preserve">Figure S3. </w:t>
+        <w:t xml:space="preserve">Figure S4. </w:t>
       </w:r>
       <w:r>
         <w:rPr>
@@ -4104,7 +4353,7 @@
         <w:t xml:space="preserve">Institutions.</w:t>
       </w:r>
       <w:r>
-        <w:t xml:space="preserve"> Sapienza University of Rome 11, Sun Yat-sen University 11, Harvard University 7, University of London 7, Radboud University Nijmegen 7, University of Texas System 7.</w:t>
+        <w:t xml:space="preserve"> Sapienza University of Rome 11, Sun Yat-sen University 11, Harvard University 7, Radboud University Nijmegen 7. Two further entries with 7 articles each, University of London and University of Texas System, are aggregate organisations in the Web of Science hierarchy rather than single institutions and are reported separately for that reason.</w:t>
       </w:r>
     </w:p>
     <w:p>
@@ -4120,7 +4369,7 @@
         <w:t xml:space="preserve">Collaboration.</w:t>
       </w:r>
       <w:r>
-        <w:t xml:space="preserve"> 49 international, 36 national, 15 local; no single-authored studies (Figure S4).</w:t>
+        <w:t xml:space="preserve"> 49 international, 36 national, 15 local; no single-authored studies (Figure S5).</w:t>
       </w:r>
     </w:p>
     <w:p>
@@ -4181,7 +4430,7 @@
           <w:sz w:val="18"/>
           <w:szCs w:val="18"/>
         </w:rPr>
-        <w:t xml:space="preserve">Figure S4. </w:t>
+        <w:t xml:space="preserve">Figure S5. </w:t>
       </w:r>
       <w:r>
         <w:rPr>
@@ -4206,7 +4455,7 @@
         <w:t xml:space="preserve">Authors.</w:t>
       </w:r>
       <w:r>
-        <w:t xml:space="preserve"> Panebianco V 9 articles, Liu Y 6, Lu H 6, Zhang X 6, Xu X 6, Witjes JA 5, Catto JWF 5. The co-authorship network comprises 23 nodes and 60 edges, with modularity 0.523 and density 0.237 (Figure S5); modularity is high and the cluster structure is interpretable, indicating six research groups working largely independently.</w:t>
+        <w:t xml:space="preserve"> Panebianco V 9 articles, Liu Y 6, Lu H 6, Zhang X 6, Xu X 6, Witjes JA 5, Catto JWF 5. The co-authorship network comprises 23 nodes and 60 edges, with modularity 0.523 and density 0.237 (Figure S6); modularity is high and the cluster structure is interpretable, indicating six research groups working largely independently.</w:t>
       </w:r>
     </w:p>
     <w:p>
@@ -4267,7 +4516,7 @@
           <w:sz w:val="18"/>
           <w:szCs w:val="18"/>
         </w:rPr>
-        <w:t xml:space="preserve">Figure S5. </w:t>
+        <w:t xml:space="preserve">Figure S6. </w:t>
       </w:r>
       <w:r>
         <w:rPr>
@@ -4989,7 +5238,7 @@
         <w:jc w:val="both"/>
       </w:pPr>
       <w:r>
-        <w:t xml:space="preserve">Modularity remains in the range 0.11–0.17 at all three scales, so weak cluster separation is not an artefact of the citation-thresholded sampling design.</w:t>
+        <w:t xml:space="preserve">Modularity remains in the range 0.11–0.17 at all three scales, so weak cluster separation is not an artefact of the citation-thresholded sampling design. The comparison is anchored on the first two rows; at pool scale the network is close to complete (density 0.960), and in a network of that density modularity is bounded near zero by construction, so that row is reported for completeness rather than as independent support.</w:t>
       </w:r>
     </w:p>
     <w:p>
@@ -5019,7 +5268,7 @@
         <w:jc w:val="both"/>
       </w:pPr>
       <w:r>
-        <w:t xml:space="preserve">The table below shows where each of the 20 items of the BIBLIO guideline⁵ — developed for bibliometric reviews of the biomedical literature and registered with the EQUATOR Network — is addressed in this article. Item wording is condensed from the original checklist.</w:t>
+        <w:t xml:space="preserve">The table below shows where each of the 20 items of the BIBLIO guideline — developed for bibliometric reviews of the biomedical literature and registered with the EQUATOR Network — is addressed in this article. Item wording is condensed from the original checklist.</w:t>
       </w:r>
     </w:p>
     <w:tbl>
@@ -6416,7 +6665,7 @@
                 <w:sz w:val="17"/>
                 <w:szCs w:val="17"/>
               </w:rPr>
-              <w:t xml:space="preserve">Methods, Methods; Appendix C</w:t>
+              <w:t xml:space="preserve">Methods; Appendix C</w:t>
             </w:r>
           </w:p>
         </w:tc>
@@ -6944,7 +7193,7 @@
                 <w:sz w:val="17"/>
                 <w:szCs w:val="17"/>
               </w:rPr>
-              <w:t xml:space="preserve">Figures 7–10</w:t>
+              <w:t xml:space="preserve">Figures 3–5</w:t>
             </w:r>
           </w:p>
         </w:tc>
@@ -7794,7 +8043,7 @@
         <w:jc w:val="both"/>
       </w:pPr>
       <w:r>
-        <w:t xml:space="preserve">The table below shows where each of the 12 items of the RAMIBS guideline⁶ — developed for bibliometric and scientometric studies in the health sciences — is addressed in this article. Item wording is condensed from the original checklist.</w:t>
+        <w:t xml:space="preserve">The table below shows where each of the 12 items of the RAMIBS guideline — developed for bibliometric and scientometric studies in the health sciences — is addressed in this article. Item wording is condensed from the original checklist.</w:t>
       </w:r>
     </w:p>
     <w:tbl>
@@ -8200,7 +8449,7 @@
                 <w:sz w:val="17"/>
                 <w:szCs w:val="17"/>
               </w:rPr>
-              <w:t xml:space="preserve">Methods, Methods, Methods, Methods</w:t>
+              <w:t xml:space="preserve">Methods</w:t>
             </w:r>
           </w:p>
         </w:tc>
@@ -8404,7 +8653,7 @@
                 <w:sz w:val="17"/>
                 <w:szCs w:val="17"/>
               </w:rPr>
-              <w:t xml:space="preserve">Methods, Methods</w:t>
+              <w:t xml:space="preserve">Methods</w:t>
             </w:r>
           </w:p>
         </w:tc>
@@ -8506,7 +8755,7 @@
                 <w:sz w:val="17"/>
                 <w:szCs w:val="17"/>
               </w:rPr>
-              <w:t xml:space="preserve">Production: Results–3.2, Figures 1–2 · Impact: Results, Results · Collaboration: Results</w:t>
+              <w:t xml:space="preserve">Production: Results, Figures 1–2 · Impact: Results · Collaboration: Results</w:t>
             </w:r>
           </w:p>
         </w:tc>
@@ -8617,7 +8866,7 @@
                 <w:sz w:val="17"/>
                 <w:szCs w:val="17"/>
               </w:rPr>
-              <w:t xml:space="preserve">Macro: Results · Meso: Results · Micro: Results</w:t>
+              <w:t xml:space="preserve">Macro, meso and micro levels: Results</w:t>
             </w:r>
           </w:p>
         </w:tc>
@@ -8719,7 +8968,7 @@
                 <w:sz w:val="17"/>
                 <w:szCs w:val="17"/>
               </w:rPr>
-              <w:t xml:space="preserve">Methods, Methods</w:t>
+              <w:t xml:space="preserve">Methods</w:t>
             </w:r>
           </w:p>
         </w:tc>
@@ -8821,7 +9070,7 @@
                 <w:sz w:val="17"/>
                 <w:szCs w:val="17"/>
               </w:rPr>
-              <w:t xml:space="preserve">Methods, Methods</w:t>
+              <w:t xml:space="preserve">Methods</w:t>
             </w:r>
           </w:p>
         </w:tc>
@@ -9025,7 +9274,7 @@
                 <w:sz w:val="17"/>
                 <w:szCs w:val="17"/>
               </w:rPr>
-              <w:t xml:space="preserve">Discussion, Discussion, Limitations</w:t>
+              <w:t xml:space="preserve">Discussion; Limitations</w:t>
             </w:r>
           </w:p>
         </w:tc>
@@ -9215,7 +9464,7 @@
         <w:jc w:val="both"/>
       </w:pPr>
       <w:r>
-        <w:t xml:space="preserve">The table below shows where each of the 29 items of the GLOBAL guideline⁴ for reporting bibliometric analyses is addressed in this article.</w:t>
+        <w:t xml:space="preserve">The table below shows where each of the 29 items of the GLOBAL guideline for reporting bibliometric analyses is addressed in this article.</w:t>
       </w:r>
     </w:p>
     <w:p>
@@ -9981,7 +10230,7 @@
                 <w:sz w:val="17"/>
                 <w:szCs w:val="17"/>
               </w:rPr>
-              <w:t xml:space="preserve">Methods, Methods</w:t>
+              <w:t xml:space="preserve">Methods</w:t>
             </w:r>
           </w:p>
         </w:tc>
@@ -10083,7 +10332,7 @@
                 <w:sz w:val="17"/>
                 <w:szCs w:val="17"/>
               </w:rPr>
-              <w:t xml:space="preserve">Methods, Methods</w:t>
+              <w:t xml:space="preserve">Methods</w:t>
             </w:r>
           </w:p>
         </w:tc>
@@ -10185,7 +10434,7 @@
                 <w:sz w:val="17"/>
                 <w:szCs w:val="17"/>
               </w:rPr>
-              <w:t xml:space="preserve">Methods, Methods</w:t>
+              <w:t xml:space="preserve">Methods</w:t>
             </w:r>
           </w:p>
         </w:tc>
@@ -11001,7 +11250,7 @@
                 <w:sz w:val="17"/>
                 <w:szCs w:val="17"/>
               </w:rPr>
-              <w:t xml:space="preserve">Methods, Methods</w:t>
+              <w:t xml:space="preserve">Methods</w:t>
             </w:r>
           </w:p>
         </w:tc>
@@ -11409,7 +11658,7 @@
                 <w:sz w:val="17"/>
                 <w:szCs w:val="17"/>
               </w:rPr>
-              <w:t xml:space="preserve">Results–Results</w:t>
+              <w:t xml:space="preserve">Results</w:t>
             </w:r>
           </w:p>
         </w:tc>
@@ -12225,7 +12474,7 @@
                 <w:sz w:val="17"/>
                 <w:szCs w:val="17"/>
               </w:rPr>
-              <w:t xml:space="preserve">References (19–21: Clauset, Hirsch, Kleinberg); Methods (software versions)</w:t>
+              <w:t xml:space="preserve">References 6 and 7 (Clauset, Kleinberg) and 8–10 (reporting guidelines); Methods (software versions)</w:t>
             </w:r>
           </w:p>
         </w:tc>

</xml_diff>